<commit_message>
Usun zbedne frazy 'Twoj priorytet' z planu
Co-authored-by: Tymon <tymonszyler@gmail.com>
</commit_message>
<xml_diff>
--- a/Plan_treningowy.docx
+++ b/Plan_treningowy.docx
@@ -4233,7 +4233,7 @@
           <w:color w:val="555555"/>
           <w:sz w:val="22"/>
         </w:rPr>
-        <w:t>Objętość dla wzrostu mięśni + cluster podciąganie jako bodziec siłowy (Twój priorytet).</w:t>
+        <w:t>Objętość dla wzrostu mięśni + cluster podciąganie jako bodziec siłowy.</w:t>
       </w:r>
     </w:p>
     <w:tbl>
@@ -7154,7 +7154,7 @@
                 <w:b w:val="0"/>
                 <w:sz w:val="19"/>
               </w:rPr>
-              <w:t>Twój priorytet, łatwy reset, wysoka intensywność</w:t>
+              <w:t>Łatwy reset, wysoka intensywność</w:t>
             </w:r>
           </w:p>
         </w:tc>

</xml_diff>